<commit_message>
moved template from local to postgresql
</commit_message>
<xml_diff>
--- a/server/docs/Output2.docx
+++ b/server/docs/Output2.docx
@@ -47,7 +47,7 @@
         </w:rPr>
       </w:pPr>
       <w:r>
-        <w:t>This Deed of Lease is made at 12:33 this 3 day of MARCH, 2026 between david of Telangana hereinafter called 'The Lessor' of the One Part and john also of Telangana hereinafter called 'The Lessee' of the Other Part.</w:t>
+        <w:t>This Deed of Lease is made at 12:34 this 2 day of march, 2026 between david of telangana hereinafter called 'The Lessor' of the One Part and john also of telangana hereinafter called 'The Lessee' of the Other Part.</w:t>
       </w:r>
     </w:p>
     <w:p>
@@ -112,7 +112,7 @@
         </w:rPr>
       </w:pPr>
       <w:r>
-        <w:t>1.     In pursuance of the said agreement and in consideration of the rent hereby reserved and of the terms and conditions, covenants and agreements herein contained and on the part of the Lessee to be observed and performed the Lessor doth hereby demise unto the Lessee all that the said land and premises situated at HYDERABAD and described in the Schedule hereunder written (hereinafter for the brevity's sake referred to as 'the demised premises') to hold the demised premises unto the Lessee (and his heirs, executors, administrators and assigns) for a term of 3 years commencing from the 1st day of MARCH, 2026, but subject to the earlier determination of this demise as hereinafter provided and yielding and paying therefor during the said term the monthly ground rent of Rs 30000 free and clear of all deductions and strictly in advance on or before the 5th day of each and every calendar month. The first of such monthly ground rent shall be paid on the 5th day of MARCH and the subsequent rent to be paid on or before the 5th day of every succeeding month regularly.</w:t>
+        <w:t>1.     In pursuance of the said agreement and in consideration of the rent hereby reserved and of the terms and conditions, covenants and agreements herein contained and on the part of the Lessee to be observed and performed the Lessor doth hereby demise unto the Lessee all that the said land and premises situated at HYDERABAD and described in the Schedule hereunder written (hereinafter for the brevity's sake referred to as 'the demised premises') to hold the demised premises unto the Lessee (and his heirs, executors, administrators and assigns) for a term of 3 years commencing from the 1st day of march, 2026, but subject to the earlier determination of this demise as hereinafter provided and yielding and paying therefor during the said term the monthly ground rent of Rs 30000 free and clear of all deductions and strictly in advance on or before the 5th day of each and every calendar month. The first of such monthly ground rent shall be paid on the 5th day of march and the subsequent rent to be paid on or before the 5th day of every succeeding month regularly.</w:t>
       </w:r>
     </w:p>
     <w:p>
@@ -146,7 +146,7 @@
         </w:rPr>
       </w:pPr>
       <w:r>
-        <w:t>a.     To pay the ground rent hereby reserved on the days and in the manner aforesaid clears of all deductions. The first of such monthly rent as hereinbefore provided shall be paid on the 5th of MARCH and the subsequent rent shall be paid on the 5th day of every succeeding month regularly and If the-ground rent is not paid on the due dates the Lessee shall pay interest thereon at the rate of 10 % per annum from the due date till payment, though the payment of Interest shall not entitle the Lessee to make default in payment of rent on due dates.</w:t>
+        <w:t>a.     To pay the ground rent hereby reserved on the days and in the manner aforesaid clears of all deductions. The first of such monthly rent as hereinbefore provided shall be paid on the 5th of march and the subsequent rent shall be paid on the 5th day of every succeeding month regularly and If the-ground rent is not paid on the due dates the Lessee shall pay interest thereon at the rate of 20 % per annum from the due date till payment, though the payment of Interest shall not entitle the Lessee to make default in payment of rent on due dates.</w:t>
       </w:r>
     </w:p>
     <w:p>

</xml_diff>